<commit_message>
Reorganiza documentación y renombra carpetas del proyecto
</commit_message>
<xml_diff>
--- a/razi/Guia_Funcionamiento_Angular.docx
+++ b/razi/Guia_Funcionamiento_Angular.docx
@@ -174,7 +174,7 @@
     </w:p>
     <w:p>
       <w:r>
-        <w:t>El cliente es una SPA Angular 18 con componentes standalone, Angular Router, Angular Material, Reactive Forms, HttpClient y RxJS. Los componentes renderizan y coordinan interacción; los servicios agrupan operaciones HTTP, autenticación, caché y estado compartido; las interfaces tipan los objetos que se intercambian. La persistencia, validación definitiva y transacciones pertenecen al backend Java.</w:t>
+        <w:t>El cliente es una SPA Angular 22 con componentes standalone, Angular Router, Angular Material, Reactive Forms, HttpClient y RxJS. Los componentes renderizan y coordinan interacción; los servicios agrupan operaciones HTTP, autenticación, caché y estado compartido; las interfaces tipan los objetos que se intercambian. La persistencia, validación definitiva y transacciones pertenecen al backend Java.</w:t>
       </w:r>
     </w:p>
     <w:p>
@@ -190,61 +190,54 @@
           <w:sz w:val="16"/>
         </w:rPr>
         <w:t>main.ts</w:t>
-      </w:r>
-      <w:r>
         <w:br/>
-      </w:r>
+        <w:t xml:space="preserve">  └─ bootstrapApplication(AppComponent, appConfig)</w:t>
+        <w:br/>
+        <w:t xml:space="preserve">       ├─ provideRouter(routes)</w:t>
+        <w:br/>
+        <w:t xml:space="preserve">       ├─ provideHttpClient(withXhr(), withInterceptors([jwtInterceptor]))</w:t>
+        <w:br/>
+        <w:t xml:space="preserve">       └─ AppComponent → RouterOutlet → pantalla activa</w:t>
+      </w:r>
+      <w:r/>
       <w:r>
         <w:rPr>
           <w:rFonts w:ascii="Cascadia Code" w:hAnsi="Cascadia Code"/>
           <w:color w:val="24364B"/>
           <w:sz w:val="16"/>
         </w:rPr>
-        <w:t xml:space="preserve">  └─ bootstrapApplication(AppComponent, appConfig)</w:t>
-      </w:r>
-      <w:r>
-        <w:br/>
-      </w:r>
+      </w:r>
+      <w:r/>
       <w:r>
         <w:rPr>
           <w:rFonts w:ascii="Cascadia Code" w:hAnsi="Cascadia Code"/>
           <w:color w:val="24364B"/>
           <w:sz w:val="16"/>
         </w:rPr>
-        <w:t xml:space="preserve">       ├─ provideRouter(routes)</w:t>
-      </w:r>
-      <w:r>
-        <w:br/>
-      </w:r>
+      </w:r>
+      <w:r/>
       <w:r>
         <w:rPr>
           <w:rFonts w:ascii="Cascadia Code" w:hAnsi="Cascadia Code"/>
           <w:color w:val="24364B"/>
           <w:sz w:val="16"/>
         </w:rPr>
-        <w:t xml:space="preserve">       ├─ provideHttpClient(withInterceptors([jwtInterceptor]))</w:t>
-      </w:r>
-      <w:r>
-        <w:br/>
-      </w:r>
+      </w:r>
+      <w:r/>
       <w:r>
         <w:rPr>
           <w:rFonts w:ascii="Cascadia Code" w:hAnsi="Cascadia Code"/>
           <w:color w:val="24364B"/>
           <w:sz w:val="16"/>
         </w:rPr>
-        <w:t xml:space="preserve">       ├─ provideAnimations()</w:t>
-      </w:r>
-      <w:r>
-        <w:br/>
-      </w:r>
+      </w:r>
+      <w:r/>
       <w:r>
         <w:rPr>
           <w:rFonts w:ascii="Cascadia Code" w:hAnsi="Cascadia Code"/>
           <w:color w:val="24364B"/>
           <w:sz w:val="16"/>
         </w:rPr>
-        <w:t xml:space="preserve">       └─ AppComponent → RouterOutlet → pantalla activa</w:t>
       </w:r>
     </w:p>
     <w:tbl>

</xml_diff>